<commit_message>
update one-pager for ruben affiliation
</commit_message>
<xml_diff>
--- a/reviews, responses, and recommendations/Cikara et al - 2014 - Their pain gives us pleasure/2 response/Cikara et al author response.docx
+++ b/reviews, responses, and recommendations/Cikara et al - 2014 - Their pain gives us pleasure/2 response/Cikara et al author response.docx
@@ -173,8 +173,16 @@
                               <w:rPr>
                                 <w:color w:val="000000"/>
                                 <w:szCs w:val="22"/>
+                                <w:lang w:val="fr-CH"/>
                               </w:rPr>
-                              <w:t>Cikara, M., Bruneau, E., Van Bavel, J. J., &amp; Saxe, R. (2014). Their pain gives us pleasure: How intergroup dynamics shape empathic failures and counter-empathic responses. Journal of experimental social psychology, 55, 110-125.</w:t>
+                              <w:t xml:space="preserve">Cikara, M., Bruneau, E., Van Bavel, J. J., &amp; Saxe, R. (2014). </w:t>
+                            </w:r>
+                            <w:r>
+                              <w:rPr>
+                                <w:color w:val="000000"/>
+                                <w:szCs w:val="22"/>
+                              </w:rPr>
+                              <w:t>Their pain gives us pleasure: How intergroup dynamics shape empathic failures and counter-empathic responses. Journal of experimental social psychology, 55, 110-125.</w:t>
                             </w:r>
                           </w:p>
                         </w:txbxContent>
@@ -208,8 +216,16 @@
                         <w:rPr>
                           <w:color w:val="000000"/>
                           <w:szCs w:val="22"/>
+                          <w:lang w:val="fr-CH"/>
                         </w:rPr>
-                        <w:t>Cikara, M., Bruneau, E., Van Bavel, J. J., &amp; Saxe, R. (2014). Their pain gives us pleasure: How intergroup dynamics shape empathic failures and counter-empathic responses. Journal of experimental social psychology, 55, 110-125.</w:t>
+                        <w:t xml:space="preserve">Cikara, M., Bruneau, E., Van Bavel, J. J., &amp; Saxe, R. (2014). </w:t>
+                      </w:r>
+                      <w:r>
+                        <w:rPr>
+                          <w:color w:val="000000"/>
+                          <w:szCs w:val="22"/>
+                        </w:rPr>
+                        <w:t>Their pain gives us pleasure: How intergroup dynamics shape empathic failures and counter-empathic responses. Journal of experimental social psychology, 55, 110-125.</w:t>
                       </w:r>
                     </w:p>
                   </w:txbxContent>
@@ -892,6 +908,7 @@
       </w:rPr>
       <w:t xml:space="preserve">Cite as: </w:t>
     </w:r>
+    <w:proofErr w:type="spellStart"/>
     <w:r>
       <w:rPr>
         <w:bCs/>
@@ -901,6 +918,7 @@
       </w:rPr>
       <w:t>Cikara</w:t>
     </w:r>
+    <w:proofErr w:type="spellEnd"/>
     <w:r>
       <w:rPr>
         <w:bCs/>
@@ -1030,7 +1048,7 @@
         <w:sz w:val="20"/>
         <w:szCs w:val="20"/>
       </w:rPr>
-      <w:t>URL</w:t>
+      <w:t>https://psyarxiv.com/nqkvg</w:t>
     </w:r>
   </w:p>
   <w:p>
@@ -1064,18 +1082,19 @@
       <w:r>
         <w:rPr>
           <w:rStyle w:val="Hyperlink"/>
-          <w:color w:val="A7002B"/>
           <w:sz w:val="20"/>
           <w:szCs w:val="20"/>
-        </w:rPr>
-        <w:t>TBD</w:t>
+          <w:lang w:val="en-US"/>
+        </w:rPr>
+        <w:t>https://osf.io/fpw4r/</w:t>
       </w:r>
     </w:hyperlink>
     <w:r>
       <w:rPr>
-        <w:color w:val="C00000"/>
+        <w:color w:val="808080" w:themeColor="background1" w:themeShade="80"/>
         <w:sz w:val="20"/>
         <w:szCs w:val="20"/>
+        <w:lang w:val="en-US"/>
       </w:rPr>
       <w:t xml:space="preserve"> </w:t>
     </w:r>
@@ -1979,6 +1998,7 @@
   <w:style w:type="character" w:default="1" w:styleId="DefaultParagraphFont">
     <w:name w:val="Default Paragraph Font"/>
     <w:uiPriority w:val="1"/>
+    <w:semiHidden/>
     <w:unhideWhenUsed/>
   </w:style>
   <w:style w:type="table" w:default="1" w:styleId="TableNormal">
@@ -2109,6 +2129,18 @@
       <w:ind w:left="720"/>
       <w:contextualSpacing/>
     </w:pPr>
+  </w:style>
+  <w:style w:type="character" w:styleId="UnresolvedMention">
+    <w:name w:val="Unresolved Mention"/>
+    <w:basedOn w:val="DefaultParagraphFont"/>
+    <w:uiPriority w:val="99"/>
+    <w:semiHidden/>
+    <w:unhideWhenUsed/>
+    <w:rsid w:val="00A03866"/>
+    <w:rPr>
+      <w:color w:val="605E5C"/>
+      <w:shd w:val="clear" w:color="auto" w:fill="E1DFDD"/>
+    </w:rPr>
   </w:style>
 </w:styles>
 </file>

</xml_diff>